<commit_message>
added quiz 2 and exit ticket 2
</commit_message>
<xml_diff>
--- a/problem_sets/Problem Set 3.docx
+++ b/problem_sets/Problem Set 3.docx
@@ -223,7 +223,29 @@
         <w:spacing w:after="80"/>
       </w:pPr>
       <w:r>
-        <w:t>Let the discrete-time sequence be x[n]=δ[n]+2δ[n−1], obtained from a valid bandlimited sampling process with sample period T.</w:t>
+        <w:t xml:space="preserve">Let the discrete-time sequence be </w:t>
+      </w:r>
+      <m:oMath>
+        <m:r>
+          <w:rPr>
+            <w:rFonts w:ascii="Cambria Math" w:hAnsi="Cambria Math"/>
+          </w:rPr>
+          <m:t>x[n]=δ[n]+2δ[n-1]</m:t>
+        </m:r>
+      </m:oMath>
+      <w:r>
+        <w:t xml:space="preserve">, obtained from a valid bandlimited sampling process with sample period </w:t>
+      </w:r>
+      <m:oMath>
+        <m:r>
+          <w:rPr>
+            <w:rFonts w:ascii="Cambria Math" w:hAnsi="Cambria Math"/>
+          </w:rPr>
+          <m:t>T</m:t>
+        </m:r>
+      </m:oMath>
+      <w:r>
+        <w:t>.</w:t>
       </w:r>
     </w:p>
     <w:p>
@@ -231,703 +253,14 @@
         <w:spacing w:after="80"/>
       </w:pPr>
       <w:r>
-        <w:t xml:space="preserve">(a)  Write the ideal continuous-time reconstructed signal </w:t>
-      </w:r>
-      <w:proofErr w:type="spellStart"/>
-      <w:r>
-        <w:t>x_r</w:t>
-      </w:r>
-      <w:proofErr w:type="spellEnd"/>
-      <w:r>
-        <w:t xml:space="preserve">(t) using normalized </w:t>
-      </w:r>
-      <w:proofErr w:type="spellStart"/>
-      <w:r>
-        <w:t>sinc</w:t>
-      </w:r>
-      <w:proofErr w:type="spellEnd"/>
-      <w:r>
-        <w:t>(u)=sin(πu)/(πu).</w:t>
-      </w:r>
-    </w:p>
-    <w:p>
-      <w:pPr>
-        <w:spacing w:after="80"/>
-      </w:pPr>
-      <w:r>
-        <w:t xml:space="preserve">(b)  Verify </w:t>
-      </w:r>
-      <w:proofErr w:type="spellStart"/>
-      <w:r>
-        <w:t>x_r</w:t>
-      </w:r>
-      <w:proofErr w:type="spellEnd"/>
-      <w:r>
-        <w:t xml:space="preserve">(0)=1 and </w:t>
-      </w:r>
-      <w:proofErr w:type="spellStart"/>
-      <w:r>
-        <w:t>x_r</w:t>
-      </w:r>
-      <w:proofErr w:type="spellEnd"/>
-      <w:r>
-        <w:t>(T)=2.</w:t>
-      </w:r>
-    </w:p>
-    <w:p>
-      <w:pPr>
-        <w:spacing w:after="80"/>
-      </w:pPr>
-      <w:r>
-        <w:t xml:space="preserve">(c)  Compute </w:t>
-      </w:r>
-      <w:proofErr w:type="spellStart"/>
-      <w:r>
-        <w:t>x_r</w:t>
-      </w:r>
-      <w:proofErr w:type="spellEnd"/>
-      <w:r>
-        <w:t>(T/2).</w:t>
-      </w:r>
-    </w:p>
-    <w:p>
-      <w:pPr>
-        <w:spacing w:after="80"/>
-        <w:rPr>
-          <w:b/>
-          <w:bCs/>
-        </w:rPr>
-      </w:pPr>
-    </w:p>
-    <w:p>
-      <w:pPr>
-        <w:spacing w:after="80"/>
-      </w:pPr>
-      <w:r>
-        <w:t xml:space="preserve">An LTI system has </w:t>
-      </w:r>
-      <m:oMath>
-        <m:r>
-          <w:rPr>
-            <w:rFonts w:ascii="Cambria Math" w:hAnsi="Cambria Math"/>
-          </w:rPr>
-          <m:t>H(</m:t>
-        </m:r>
-        <m:sSup>
-          <m:sSupPr>
-            <m:ctrlPr>
-              <w:rPr>
-                <w:rFonts w:ascii="Cambria Math" w:hAnsi="Cambria Math"/>
-                <w:i/>
-              </w:rPr>
-            </m:ctrlPr>
-          </m:sSupPr>
-          <m:e>
-            <m:r>
-              <w:rPr>
-                <w:rFonts w:ascii="Cambria Math" w:hAnsi="Cambria Math"/>
-              </w:rPr>
-              <m:t>e</m:t>
-            </m:r>
-          </m:e>
-          <m:sup>
-            <m:r>
-              <w:rPr>
-                <w:rFonts w:ascii="Cambria Math" w:hAnsi="Cambria Math"/>
-              </w:rPr>
-              <m:t>jω</m:t>
-            </m:r>
-          </m:sup>
-        </m:sSup>
-        <m:r>
-          <w:rPr>
-            <w:rFonts w:ascii="Cambria Math" w:hAnsi="Cambria Math"/>
-          </w:rPr>
-          <m:t>)=1+0.5</m:t>
-        </m:r>
-        <m:sSup>
-          <m:sSupPr>
-            <m:ctrlPr>
-              <w:rPr>
-                <w:rFonts w:ascii="Cambria Math" w:hAnsi="Cambria Math"/>
-                <w:i/>
-              </w:rPr>
-            </m:ctrlPr>
-          </m:sSupPr>
-          <m:e>
-            <m:r>
-              <w:rPr>
-                <w:rFonts w:ascii="Cambria Math" w:hAnsi="Cambria Math"/>
-              </w:rPr>
-              <m:t>e</m:t>
-            </m:r>
-          </m:e>
-          <m:sup>
-            <m:r>
-              <w:rPr>
-                <w:rFonts w:ascii="Cambria Math" w:hAnsi="Cambria Math"/>
-              </w:rPr>
-              <m:t>-jω</m:t>
-            </m:r>
-          </m:sup>
-        </m:sSup>
-      </m:oMath>
-      <w:r>
-        <w:t xml:space="preserve">. The input is </w:t>
-      </w:r>
-      <m:oMath>
-        <m:r>
-          <w:rPr>
-            <w:rFonts w:ascii="Cambria Math" w:hAnsi="Cambria Math"/>
-          </w:rPr>
-          <m:t>x[n]=2</m:t>
-        </m:r>
-        <m:r>
-          <m:rPr>
-            <m:sty m:val="p"/>
-          </m:rPr>
-          <w:rPr>
-            <w:rFonts w:ascii="Cambria Math" w:hAnsi="Cambria Math"/>
-          </w:rPr>
-          <m:t>cos</m:t>
-        </m:r>
-        <m:r>
-          <w:rPr>
-            <w:rFonts w:ascii="Cambria Math" w:hAnsi="Cambria Math"/>
-          </w:rPr>
-          <m:t>(πn/3+π/4)</m:t>
-        </m:r>
-      </m:oMath>
-      <w:r>
-        <w:t>.</w:t>
-      </w:r>
-    </w:p>
-    <w:p>
-      <w:pPr>
-        <w:spacing w:after="80"/>
-      </w:pPr>
-      <w:r>
-        <w:t xml:space="preserve">a) Evaluate </w:t>
-      </w:r>
-      <m:oMath>
-        <m:r>
-          <w:rPr>
-            <w:rFonts w:ascii="Cambria Math" w:hAnsi="Cambria Math"/>
-          </w:rPr>
-          <m:t>H(</m:t>
-        </m:r>
-        <m:sSup>
-          <m:sSupPr>
-            <m:ctrlPr>
-              <w:rPr>
-                <w:rFonts w:ascii="Cambria Math" w:hAnsi="Cambria Math"/>
-                <w:i/>
-              </w:rPr>
-            </m:ctrlPr>
-          </m:sSupPr>
-          <m:e>
-            <m:r>
-              <w:rPr>
-                <w:rFonts w:ascii="Cambria Math" w:hAnsi="Cambria Math"/>
-              </w:rPr>
-              <m:t>e</m:t>
-            </m:r>
-          </m:e>
-          <m:sup>
-            <m:r>
-              <w:rPr>
-                <w:rFonts w:ascii="Cambria Math" w:hAnsi="Cambria Math"/>
-              </w:rPr>
-              <m:t>jπ/3</m:t>
-            </m:r>
-          </m:sup>
-        </m:sSup>
-        <m:r>
-          <w:rPr>
-            <w:rFonts w:ascii="Cambria Math" w:hAnsi="Cambria Math"/>
-          </w:rPr>
-          <m:t>)</m:t>
-        </m:r>
-      </m:oMath>
-      <w:r>
-        <w:t xml:space="preserve"> in rectangular form.</w:t>
-      </w:r>
-    </w:p>
-    <w:p>
-      <w:pPr>
-        <w:spacing w:after="80"/>
-      </w:pPr>
-      <w:r>
-        <w:t>b) Find its magnitude and phase.</w:t>
-      </w:r>
-    </w:p>
-    <w:p>
-      <w:pPr>
-        <w:spacing w:after="240"/>
-      </w:pPr>
-      <w:r>
-        <w:t xml:space="preserve">c) Write the steady-state output </w:t>
-      </w:r>
-      <m:oMath>
-        <m:r>
-          <w:rPr>
-            <w:rFonts w:ascii="Cambria Math" w:hAnsi="Cambria Math"/>
-          </w:rPr>
-          <m:t>y[n]</m:t>
-        </m:r>
-      </m:oMath>
-      <w:r>
-        <w:t xml:space="preserve"> in cosine form.</w:t>
-      </w:r>
-    </w:p>
-    <w:p>
-      <w:pPr>
-        <w:spacing w:after="80"/>
-        <w:rPr>
-          <w:b/>
-          <w:bCs/>
-        </w:rPr>
-      </w:pPr>
-      <w:r>
-        <w:rPr>
-          <w:b/>
-          <w:bCs/>
-        </w:rPr>
-        <w:t>2. DTFT shifting and a spectral zero</w:t>
-      </w:r>
-    </w:p>
-    <w:p>
-      <w:pPr>
-        <w:spacing w:after="80"/>
-      </w:pPr>
-      <w:r>
-        <w:t xml:space="preserve">Let </w:t>
-      </w:r>
-      <m:oMath>
-        <m:r>
-          <w:rPr>
-            <w:rFonts w:ascii="Cambria Math" w:hAnsi="Cambria Math"/>
-          </w:rPr>
-          <m:t>x[n]=</m:t>
-        </m:r>
-        <m:sSup>
-          <m:sSupPr>
-            <m:ctrlPr>
-              <w:rPr>
-                <w:rFonts w:ascii="Cambria Math" w:hAnsi="Cambria Math"/>
-                <w:i/>
-              </w:rPr>
-            </m:ctrlPr>
-          </m:sSupPr>
-          <m:e>
-            <m:d>
-              <m:dPr>
-                <m:ctrlPr>
-                  <w:rPr>
-                    <w:rFonts w:ascii="Cambria Math" w:hAnsi="Cambria Math"/>
-                    <w:i/>
-                  </w:rPr>
-                </m:ctrlPr>
-              </m:dPr>
-              <m:e>
-                <m:r>
-                  <w:rPr>
-                    <w:rFonts w:ascii="Cambria Math" w:hAnsi="Cambria Math"/>
-                  </w:rPr>
-                  <m:t>0.5</m:t>
-                </m:r>
-              </m:e>
-            </m:d>
-          </m:e>
-          <m:sup>
-            <m:r>
-              <w:rPr>
-                <w:rFonts w:ascii="Cambria Math" w:hAnsi="Cambria Math"/>
-              </w:rPr>
-              <m:t>n</m:t>
-            </m:r>
-          </m:sup>
-        </m:sSup>
-        <m:r>
-          <w:rPr>
-            <w:rFonts w:ascii="Cambria Math" w:hAnsi="Cambria Math"/>
-          </w:rPr>
-          <m:t xml:space="preserve"> u[n]</m:t>
-        </m:r>
-      </m:oMath>
-      <w:r>
-        <w:t xml:space="preserve"> and </w:t>
-      </w:r>
-      <m:oMath>
-        <m:r>
-          <w:rPr>
-            <w:rFonts w:ascii="Cambria Math" w:hAnsi="Cambria Math"/>
-          </w:rPr>
-          <m:t>y[n]=x[n-2]-x[n]</m:t>
-        </m:r>
-      </m:oMath>
-      <w:r>
-        <w:t>.</w:t>
-      </w:r>
-    </w:p>
-    <w:p>
-      <w:pPr>
-        <w:spacing w:after="80"/>
-      </w:pPr>
-      <w:r>
-        <w:t xml:space="preserve">a) Find </w:t>
-      </w:r>
-      <m:oMath>
-        <m:r>
-          <w:rPr>
-            <w:rFonts w:ascii="Cambria Math" w:hAnsi="Cambria Math"/>
-          </w:rPr>
-          <m:t>X(</m:t>
-        </m:r>
-        <m:sSup>
-          <m:sSupPr>
-            <m:ctrlPr>
-              <w:rPr>
-                <w:rFonts w:ascii="Cambria Math" w:hAnsi="Cambria Math"/>
-                <w:i/>
-              </w:rPr>
-            </m:ctrlPr>
-          </m:sSupPr>
-          <m:e>
-            <m:r>
-              <w:rPr>
-                <w:rFonts w:ascii="Cambria Math" w:hAnsi="Cambria Math"/>
-              </w:rPr>
-              <m:t>e</m:t>
-            </m:r>
-          </m:e>
-          <m:sup>
-            <m:r>
-              <w:rPr>
-                <w:rFonts w:ascii="Cambria Math" w:hAnsi="Cambria Math"/>
-              </w:rPr>
-              <m:t>jω</m:t>
-            </m:r>
-          </m:sup>
-        </m:sSup>
-        <m:r>
-          <w:rPr>
-            <w:rFonts w:ascii="Cambria Math" w:hAnsi="Cambria Math"/>
-          </w:rPr>
-          <m:t>)</m:t>
-        </m:r>
-      </m:oMath>
-      <w:r>
-        <w:t>.</w:t>
-      </w:r>
-    </w:p>
-    <w:p>
-      <w:pPr>
-        <w:spacing w:after="80"/>
-      </w:pPr>
-      <w:r>
-        <w:t xml:space="preserve">b) Use the time-shift property to find </w:t>
-      </w:r>
-      <m:oMath>
-        <m:r>
-          <w:rPr>
-            <w:rFonts w:ascii="Cambria Math" w:hAnsi="Cambria Math"/>
-          </w:rPr>
-          <m:t>Y(</m:t>
-        </m:r>
-        <m:sSup>
-          <m:sSupPr>
-            <m:ctrlPr>
-              <w:rPr>
-                <w:rFonts w:ascii="Cambria Math" w:hAnsi="Cambria Math"/>
-                <w:i/>
-              </w:rPr>
-            </m:ctrlPr>
-          </m:sSupPr>
-          <m:e>
-            <m:r>
-              <w:rPr>
-                <w:rFonts w:ascii="Cambria Math" w:hAnsi="Cambria Math"/>
-              </w:rPr>
-              <m:t>e</m:t>
-            </m:r>
-          </m:e>
-          <m:sup>
-            <m:r>
-              <w:rPr>
-                <w:rFonts w:ascii="Cambria Math" w:hAnsi="Cambria Math"/>
-              </w:rPr>
-              <m:t>jω</m:t>
-            </m:r>
-          </m:sup>
-        </m:sSup>
-        <m:r>
-          <w:rPr>
-            <w:rFonts w:ascii="Cambria Math" w:hAnsi="Cambria Math"/>
-          </w:rPr>
-          <m:t>)</m:t>
-        </m:r>
-      </m:oMath>
-      <w:r>
-        <w:t>.</w:t>
-      </w:r>
-    </w:p>
-    <w:p>
-      <w:pPr>
-        <w:spacing w:after="240"/>
-      </w:pPr>
-      <w:r>
-        <w:t xml:space="preserve">c) Evaluate </w:t>
-      </w:r>
-      <m:oMath>
-        <m:r>
-          <w:rPr>
-            <w:rFonts w:ascii="Cambria Math" w:hAnsi="Cambria Math"/>
-          </w:rPr>
-          <m:t>Y(</m:t>
-        </m:r>
-        <m:sSup>
-          <m:sSupPr>
-            <m:ctrlPr>
-              <w:rPr>
-                <w:rFonts w:ascii="Cambria Math" w:hAnsi="Cambria Math"/>
-                <w:i/>
-              </w:rPr>
-            </m:ctrlPr>
-          </m:sSupPr>
-          <m:e>
-            <m:r>
-              <w:rPr>
-                <w:rFonts w:ascii="Cambria Math" w:hAnsi="Cambria Math"/>
-              </w:rPr>
-              <m:t>e</m:t>
-            </m:r>
-          </m:e>
-          <m:sup>
-            <m:r>
-              <w:rPr>
-                <w:rFonts w:ascii="Cambria Math" w:hAnsi="Cambria Math"/>
-              </w:rPr>
-              <m:t>j0</m:t>
-            </m:r>
-          </m:sup>
-        </m:sSup>
-        <m:r>
-          <w:rPr>
-            <w:rFonts w:ascii="Cambria Math" w:hAnsi="Cambria Math"/>
-          </w:rPr>
-          <m:t>)</m:t>
-        </m:r>
-      </m:oMath>
-      <w:r>
-        <w:t xml:space="preserve"> and explain what that value says about the sum of </w:t>
-      </w:r>
-      <m:oMath>
-        <m:r>
-          <w:rPr>
-            <w:rFonts w:ascii="Cambria Math" w:hAnsi="Cambria Math"/>
-          </w:rPr>
-          <m:t>y[n]</m:t>
-        </m:r>
-      </m:oMath>
-      <w:r>
-        <w:t>.</w:t>
-      </w:r>
-    </w:p>
-    <w:p>
-      <w:pPr>
-        <w:spacing w:after="80"/>
-        <w:rPr>
-          <w:b/>
-          <w:bCs/>
-        </w:rPr>
-      </w:pPr>
-      <w:r>
-        <w:rPr>
-          <w:b/>
-          <w:bCs/>
-        </w:rPr>
-        <w:t>3. Difference equation to frequency response</w:t>
-      </w:r>
-    </w:p>
-    <w:p>
-      <w:pPr>
-        <w:spacing w:after="80"/>
-      </w:pPr>
-      <w:r>
-        <w:t xml:space="preserve">A causal system satisfies </w:t>
-      </w:r>
-      <m:oMath>
-        <m:r>
-          <w:rPr>
-            <w:rFonts w:ascii="Cambria Math" w:hAnsi="Cambria Math"/>
-          </w:rPr>
-          <m:t>y[n]-0.8y[n-1]=x[n]-x[n-1]</m:t>
-        </m:r>
-      </m:oMath>
-      <w:r>
-        <w:t>, with zero initial conditions.</w:t>
-      </w:r>
-    </w:p>
-    <w:p>
-      <w:pPr>
-        <w:spacing w:after="80"/>
-      </w:pPr>
-      <w:r>
-        <w:t xml:space="preserve">a) Derive </w:t>
-      </w:r>
-      <m:oMath>
-        <m:r>
-          <w:rPr>
-            <w:rFonts w:ascii="Cambria Math" w:hAnsi="Cambria Math"/>
-          </w:rPr>
-          <m:t>H(</m:t>
-        </m:r>
-        <m:sSup>
-          <m:sSupPr>
-            <m:ctrlPr>
-              <w:rPr>
-                <w:rFonts w:ascii="Cambria Math" w:hAnsi="Cambria Math"/>
-                <w:i/>
-              </w:rPr>
-            </m:ctrlPr>
-          </m:sSupPr>
-          <m:e>
-            <m:r>
-              <w:rPr>
-                <w:rFonts w:ascii="Cambria Math" w:hAnsi="Cambria Math"/>
-              </w:rPr>
-              <m:t>e</m:t>
-            </m:r>
-          </m:e>
-          <m:sup>
-            <m:r>
-              <w:rPr>
-                <w:rFonts w:ascii="Cambria Math" w:hAnsi="Cambria Math"/>
-              </w:rPr>
-              <m:t>jω</m:t>
-            </m:r>
-          </m:sup>
-        </m:sSup>
-        <m:r>
-          <w:rPr>
-            <w:rFonts w:ascii="Cambria Math" w:hAnsi="Cambria Math"/>
-          </w:rPr>
-          <m:t>)</m:t>
-        </m:r>
-      </m:oMath>
-      <w:r>
-        <w:t>.</w:t>
-      </w:r>
-    </w:p>
-    <w:p>
-      <w:pPr>
-        <w:spacing w:after="80"/>
-      </w:pPr>
-      <w:r>
-        <w:t xml:space="preserve">b) Evaluate </w:t>
-      </w:r>
-      <m:oMath>
-        <m:r>
-          <w:rPr>
-            <w:rFonts w:ascii="Cambria Math" w:hAnsi="Cambria Math"/>
-          </w:rPr>
-          <m:t>H</m:t>
-        </m:r>
-      </m:oMath>
-      <w:r>
-        <w:t xml:space="preserve"> at </w:t>
-      </w:r>
-      <m:oMath>
-        <m:r>
-          <w:rPr>
-            <w:rFonts w:ascii="Cambria Math" w:hAnsi="Cambria Math"/>
-          </w:rPr>
-          <m:t>ω=0</m:t>
-        </m:r>
-      </m:oMath>
-      <w:r>
-        <w:t xml:space="preserve"> and </w:t>
-      </w:r>
-      <m:oMath>
-        <m:r>
-          <w:rPr>
-            <w:rFonts w:ascii="Cambria Math" w:hAnsi="Cambria Math"/>
-          </w:rPr>
-          <m:t>ω=π</m:t>
-        </m:r>
-      </m:oMath>
-      <w:r>
-        <w:t>.</w:t>
-      </w:r>
-    </w:p>
-    <w:p>
-      <w:pPr>
-        <w:spacing w:after="80"/>
-      </w:pPr>
-      <w:r>
-        <w:t>c) Based only on those values and the structure of the numerator, is the system more “low-pass-like” or “high-pass-like”? Explain.</w:t>
-      </w:r>
-    </w:p>
-    <w:p>
-      <w:pPr>
-        <w:spacing w:after="240"/>
-      </w:pPr>
-      <w:r>
-        <w:t xml:space="preserve">d) Use </w:t>
-      </w:r>
-      <w:proofErr w:type="spellStart"/>
-      <w:r>
-        <w:t>scipy.signal.freqz</w:t>
-      </w:r>
-      <w:proofErr w:type="spellEnd"/>
-      <w:r>
-        <w:t xml:space="preserve"> to check your reasoning.</w:t>
-      </w:r>
-    </w:p>
-    <w:p>
-      <w:pPr>
-        <w:spacing w:after="80"/>
-        <w:rPr>
-          <w:b/>
-          <w:bCs/>
-        </w:rPr>
-      </w:pPr>
-      <w:r>
-        <w:rPr>
-          <w:b/>
-          <w:bCs/>
-        </w:rPr>
-        <w:t>4.</w:t>
-      </w:r>
-      <w:r>
-        <w:rPr>
-          <w:b/>
-          <w:bCs/>
-        </w:rPr>
-        <w:t xml:space="preserve"> From continuous frequency to discrete frequency</w:t>
-      </w:r>
-    </w:p>
-    <w:p>
-      <w:pPr>
-        <w:spacing w:after="80"/>
-        <w:rPr>
-          <w:rFonts w:cstheme="minorHAnsi"/>
-        </w:rPr>
-      </w:pPr>
-      <w:r>
-        <w:rPr>
-          <w:rFonts w:cstheme="minorHAnsi"/>
-        </w:rPr>
-        <w:lastRenderedPageBreak/>
-        <w:t xml:space="preserve">A microphone voltage is </w:t>
+        <w:t xml:space="preserve">a)  Write the ideal continuous-time reconstructed signal </w:t>
       </w:r>
       <m:oMath>
         <m:sSub>
           <m:sSubPr>
             <m:ctrlPr>
               <w:rPr>
-                <w:rFonts w:ascii="Cambria Math" w:hAnsi="Cambria Math" w:cstheme="minorHAnsi"/>
+                <w:rFonts w:ascii="Cambria Math" w:hAnsi="Cambria Math"/>
                 <w:i/>
               </w:rPr>
             </m:ctrlPr>
@@ -935,7 +268,7 @@
           <m:e>
             <m:r>
               <w:rPr>
-                <w:rFonts w:ascii="Cambria Math" w:hAnsi="Cambria Math" w:cstheme="minorHAnsi"/>
+                <w:rFonts w:ascii="Cambria Math" w:hAnsi="Cambria Math"/>
               </w:rPr>
               <m:t>x</m:t>
             </m:r>
@@ -943,61 +276,71 @@
           <m:sub>
             <m:r>
               <w:rPr>
-                <w:rFonts w:ascii="Cambria Math" w:hAnsi="Cambria Math" w:cstheme="minorHAnsi"/>
+                <w:rFonts w:ascii="Cambria Math" w:hAnsi="Cambria Math"/>
               </w:rPr>
-              <m:t>c</m:t>
+              <m:t>r</m:t>
             </m:r>
           </m:sub>
         </m:sSub>
         <m:r>
           <w:rPr>
-            <w:rFonts w:ascii="Cambria Math" w:hAnsi="Cambria Math" w:cstheme="minorHAnsi"/>
-          </w:rPr>
-          <m:t xml:space="preserve">(t) = 2 </m:t>
-        </m:r>
+            <w:rFonts w:ascii="Cambria Math" w:hAnsi="Cambria Math"/>
+          </w:rPr>
+          <m:t>(t)</m:t>
+        </m:r>
+      </m:oMath>
+      <w:r>
+        <w:t xml:space="preserve"> using normalized </w:t>
+      </w:r>
+      <m:oMath>
         <m:r>
           <m:rPr>
             <m:sty m:val="p"/>
           </m:rPr>
           <w:rPr>
-            <w:rFonts w:ascii="Cambria Math" w:hAnsi="Cambria Math" w:cstheme="minorHAnsi"/>
-          </w:rPr>
-          <m:t>cos</m:t>
-        </m:r>
-        <m:r>
-          <w:rPr>
-            <w:rFonts w:ascii="Cambria Math" w:hAnsi="Cambria Math" w:cstheme="minorHAnsi"/>
-          </w:rPr>
-          <m:t xml:space="preserve">(2π·1000 t) + </m:t>
+            <w:rFonts w:ascii="Cambria Math" w:hAnsi="Cambria Math"/>
+          </w:rPr>
+          <m:t>sinc</m:t>
+        </m:r>
+        <m:r>
+          <w:rPr>
+            <w:rFonts w:ascii="Cambria Math" w:hAnsi="Cambria Math"/>
+          </w:rPr>
+          <m:t>(u)=</m:t>
         </m:r>
         <m:r>
           <m:rPr>
             <m:sty m:val="p"/>
           </m:rPr>
           <w:rPr>
-            <w:rFonts w:ascii="Cambria Math" w:hAnsi="Cambria Math" w:cstheme="minorHAnsi"/>
-          </w:rPr>
-          <m:t>cos</m:t>
-        </m:r>
-        <m:r>
-          <w:rPr>
-            <w:rFonts w:ascii="Cambria Math" w:hAnsi="Cambria Math" w:cstheme="minorHAnsi"/>
-          </w:rPr>
-          <m:t>(2π·5000 t)</m:t>
+            <w:rFonts w:ascii="Cambria Math" w:hAnsi="Cambria Math"/>
+          </w:rPr>
+          <m:t>sin</m:t>
+        </m:r>
+        <m:r>
+          <w:rPr>
+            <w:rFonts w:ascii="Cambria Math" w:hAnsi="Cambria Math"/>
+          </w:rPr>
+          <m:t>(πu)/(πu)</m:t>
         </m:r>
       </m:oMath>
       <w:r>
-        <w:rPr>
-          <w:rFonts w:cstheme="minorHAnsi"/>
-        </w:rPr>
-        <w:t xml:space="preserve">. It is sampled at </w:t>
+        <w:t>.</w:t>
+      </w:r>
+    </w:p>
+    <w:p>
+      <w:pPr>
+        <w:spacing w:after="80"/>
+      </w:pPr>
+      <w:r>
+        <w:t xml:space="preserve">b)  Verify </w:t>
       </w:r>
       <m:oMath>
         <m:sSub>
           <m:sSubPr>
             <m:ctrlPr>
               <w:rPr>
-                <w:rFonts w:ascii="Cambria Math" w:hAnsi="Cambria Math" w:cstheme="minorHAnsi"/>
+                <w:rFonts w:ascii="Cambria Math" w:hAnsi="Cambria Math"/>
                 <w:i/>
               </w:rPr>
             </m:ctrlPr>
@@ -1005,222 +348,36 @@
           <m:e>
             <m:r>
               <w:rPr>
-                <w:rFonts w:ascii="Cambria Math" w:hAnsi="Cambria Math" w:cstheme="minorHAnsi"/>
+                <w:rFonts w:ascii="Cambria Math" w:hAnsi="Cambria Math"/>
               </w:rPr>
-              <m:t>f</m:t>
+              <m:t>x</m:t>
             </m:r>
           </m:e>
           <m:sub>
             <m:r>
               <w:rPr>
-                <w:rFonts w:ascii="Cambria Math" w:hAnsi="Cambria Math" w:cstheme="minorHAnsi"/>
+                <w:rFonts w:ascii="Cambria Math" w:hAnsi="Cambria Math"/>
               </w:rPr>
-              <m:t>s</m:t>
+              <m:t>r</m:t>
             </m:r>
           </m:sub>
         </m:sSub>
         <m:r>
           <w:rPr>
-            <w:rFonts w:ascii="Cambria Math" w:hAnsi="Cambria Math" w:cstheme="minorHAnsi"/>
-          </w:rPr>
-          <m:t xml:space="preserve"> = 16</m:t>
+            <w:rFonts w:ascii="Cambria Math" w:hAnsi="Cambria Math"/>
+          </w:rPr>
+          <m:t>(0)=1</m:t>
         </m:r>
       </m:oMath>
       <w:r>
-        <w:rPr>
-          <w:rFonts w:cstheme="minorHAnsi"/>
-        </w:rPr>
-        <w:t xml:space="preserve"> kHz.</w:t>
-      </w:r>
-    </w:p>
-    <w:p>
-      <w:pPr>
-        <w:pStyle w:val="ListNumber2"/>
-        <w:numPr>
-          <w:ilvl w:val="0"/>
-          <w:numId w:val="0"/>
-        </w:numPr>
-        <w:spacing w:after="80"/>
-        <w:rPr>
-          <w:rFonts w:asciiTheme="minorHAnsi" w:hAnsiTheme="minorHAnsi" w:cstheme="minorHAnsi"/>
-          <w:sz w:val="24"/>
-          <w:szCs w:val="24"/>
-        </w:rPr>
-      </w:pPr>
-      <w:r>
-        <w:rPr>
-          <w:rFonts w:asciiTheme="minorHAnsi" w:hAnsiTheme="minorHAnsi" w:cstheme="minorHAnsi"/>
-          <w:sz w:val="24"/>
-          <w:szCs w:val="24"/>
-        </w:rPr>
-        <w:t xml:space="preserve">a)  Write </w:t>
-      </w:r>
-      <m:oMath>
-        <m:r>
-          <w:rPr>
-            <w:rFonts w:ascii="Cambria Math" w:hAnsi="Cambria Math" w:cstheme="minorHAnsi"/>
-            <w:sz w:val="24"/>
-            <w:szCs w:val="24"/>
-          </w:rPr>
-          <m:t>x[n]</m:t>
-        </m:r>
-      </m:oMath>
-      <w:r>
-        <w:rPr>
-          <w:rFonts w:asciiTheme="minorHAnsi" w:hAnsiTheme="minorHAnsi" w:cstheme="minorHAnsi"/>
-          <w:sz w:val="24"/>
-          <w:szCs w:val="24"/>
-        </w:rPr>
-        <w:t xml:space="preserve"> explicitly.</w:t>
-      </w:r>
-    </w:p>
-    <w:p>
-      <w:pPr>
-        <w:pStyle w:val="ListNumber2"/>
-        <w:numPr>
-          <w:ilvl w:val="0"/>
-          <w:numId w:val="0"/>
-        </w:numPr>
-        <w:spacing w:after="80"/>
-        <w:rPr>
-          <w:rFonts w:asciiTheme="minorHAnsi" w:hAnsiTheme="minorHAnsi" w:cstheme="minorHAnsi"/>
-          <w:sz w:val="24"/>
-          <w:szCs w:val="24"/>
-        </w:rPr>
-      </w:pPr>
-      <w:r>
-        <w:rPr>
-          <w:rFonts w:asciiTheme="minorHAnsi" w:hAnsiTheme="minorHAnsi" w:cstheme="minorHAnsi"/>
-          <w:sz w:val="24"/>
-          <w:szCs w:val="24"/>
-        </w:rPr>
-        <w:t xml:space="preserve">b)  Give the two discrete-time angular frequencies in rad/sample and as multiples of </w:t>
-      </w:r>
-      <m:oMath>
-        <m:r>
-          <w:rPr>
-            <w:rFonts w:ascii="Cambria Math" w:hAnsi="Cambria Math" w:cstheme="minorHAnsi"/>
-            <w:sz w:val="24"/>
-            <w:szCs w:val="24"/>
-          </w:rPr>
-          <m:t>π</m:t>
-        </m:r>
-      </m:oMath>
-      <w:r>
-        <w:rPr>
-          <w:rFonts w:asciiTheme="minorHAnsi" w:hAnsiTheme="minorHAnsi" w:cstheme="minorHAnsi"/>
-          <w:sz w:val="24"/>
-          <w:szCs w:val="24"/>
-        </w:rPr>
-        <w:t>.</w:t>
-      </w:r>
-    </w:p>
-    <w:p>
-      <w:pPr>
-        <w:pStyle w:val="ListNumber2"/>
-        <w:numPr>
-          <w:ilvl w:val="0"/>
-          <w:numId w:val="0"/>
-        </w:numPr>
-        <w:spacing w:after="240"/>
-        <w:rPr>
-          <w:rFonts w:asciiTheme="minorHAnsi" w:hAnsiTheme="minorHAnsi" w:cstheme="minorHAnsi"/>
-          <w:sz w:val="24"/>
-          <w:szCs w:val="24"/>
-        </w:rPr>
-      </w:pPr>
-      <w:r>
-        <w:rPr>
-          <w:rFonts w:asciiTheme="minorHAnsi" w:hAnsiTheme="minorHAnsi" w:cstheme="minorHAnsi"/>
-          <w:sz w:val="24"/>
-          <w:szCs w:val="24"/>
-        </w:rPr>
-        <w:t xml:space="preserve">c)  Are </w:t>
-      </w:r>
-      <w:proofErr w:type="gramStart"/>
-      <w:r>
-        <w:rPr>
-          <w:rFonts w:asciiTheme="minorHAnsi" w:hAnsiTheme="minorHAnsi" w:cstheme="minorHAnsi"/>
-          <w:sz w:val="24"/>
-          <w:szCs w:val="24"/>
-        </w:rPr>
-        <w:t>either components</w:t>
-      </w:r>
-      <w:proofErr w:type="gramEnd"/>
-      <w:r>
-        <w:rPr>
-          <w:rFonts w:asciiTheme="minorHAnsi" w:hAnsiTheme="minorHAnsi" w:cstheme="minorHAnsi"/>
-          <w:sz w:val="24"/>
-          <w:szCs w:val="24"/>
-        </w:rPr>
-        <w:t xml:space="preserve"> aliased at this sample rate? Explain.</w:t>
-      </w:r>
-    </w:p>
-    <w:p>
-      <w:pPr>
-        <w:rPr>
-          <w:b/>
-          <w:bCs/>
-        </w:rPr>
-      </w:pPr>
-      <w:r>
-        <w:rPr>
-          <w:b/>
-          <w:bCs/>
-        </w:rPr>
-        <w:br w:type="page"/>
-      </w:r>
-    </w:p>
-    <w:p>
-      <w:pPr>
-        <w:spacing w:after="80"/>
-        <w:rPr>
-          <w:b/>
-          <w:bCs/>
-        </w:rPr>
-      </w:pPr>
-      <w:r>
-        <w:rPr>
-          <w:b/>
-          <w:bCs/>
-        </w:rPr>
-        <w:lastRenderedPageBreak/>
-        <w:t>5. Spectral replicas and Nyquist margin</w:t>
-      </w:r>
-    </w:p>
-    <w:p>
-      <w:pPr>
-        <w:spacing w:after="80"/>
-        <w:rPr>
-          <w:rFonts w:cstheme="minorHAnsi"/>
-        </w:rPr>
-      </w:pPr>
-      <w:r>
-        <w:rPr>
-          <w:rFonts w:cstheme="minorHAnsi"/>
-        </w:rPr>
-        <w:t xml:space="preserve">An analog signal is strictly bandlimited to </w:t>
-      </w:r>
-      <m:oMath>
-        <m:r>
-          <w:rPr>
-            <w:rFonts w:ascii="Cambria Math" w:hAnsi="Cambria Math" w:cstheme="minorHAnsi"/>
-          </w:rPr>
-          <m:t>|f| ≤ 3.4</m:t>
-        </m:r>
-      </m:oMath>
-      <w:r>
-        <w:rPr>
-          <w:rFonts w:cstheme="minorHAnsi"/>
-        </w:rPr>
-        <w:t xml:space="preserve"> kHz and is sampled at </w:t>
+        <w:t xml:space="preserve"> and </w:t>
       </w:r>
       <m:oMath>
         <m:sSub>
           <m:sSubPr>
             <m:ctrlPr>
               <w:rPr>
-                <w:rFonts w:ascii="Cambria Math" w:hAnsi="Cambria Math" w:cstheme="minorHAnsi"/>
+                <w:rFonts w:ascii="Cambria Math" w:hAnsi="Cambria Math"/>
                 <w:i/>
               </w:rPr>
             </m:ctrlPr>
@@ -1228,399 +385,44 @@
           <m:e>
             <m:r>
               <w:rPr>
-                <w:rFonts w:ascii="Cambria Math" w:hAnsi="Cambria Math" w:cstheme="minorHAnsi"/>
+                <w:rFonts w:ascii="Cambria Math" w:hAnsi="Cambria Math"/>
               </w:rPr>
-              <m:t>f</m:t>
+              <m:t>x</m:t>
             </m:r>
           </m:e>
           <m:sub>
             <m:r>
               <w:rPr>
-                <w:rFonts w:ascii="Cambria Math" w:hAnsi="Cambria Math" w:cstheme="minorHAnsi"/>
+                <w:rFonts w:ascii="Cambria Math" w:hAnsi="Cambria Math"/>
               </w:rPr>
-              <m:t>s</m:t>
+              <m:t>r</m:t>
             </m:r>
           </m:sub>
         </m:sSub>
         <m:r>
           <w:rPr>
-            <w:rFonts w:ascii="Cambria Math" w:hAnsi="Cambria Math" w:cstheme="minorHAnsi"/>
-          </w:rPr>
-          <m:t xml:space="preserve"> = 8</m:t>
+            <w:rFonts w:ascii="Cambria Math" w:hAnsi="Cambria Math"/>
+          </w:rPr>
+          <m:t>(T)=2</m:t>
         </m:r>
       </m:oMath>
       <w:r>
-        <w:rPr>
-          <w:rFonts w:cstheme="minorHAnsi"/>
-        </w:rPr>
-        <w:t xml:space="preserve"> kHz.</w:t>
-      </w:r>
-    </w:p>
-    <w:p>
-      <w:pPr>
-        <w:pStyle w:val="ListNumber2"/>
-        <w:numPr>
-          <w:ilvl w:val="0"/>
-          <w:numId w:val="0"/>
-        </w:numPr>
-        <w:spacing w:after="80"/>
-        <w:rPr>
-          <w:rFonts w:asciiTheme="minorHAnsi" w:hAnsiTheme="minorHAnsi" w:cstheme="minorHAnsi"/>
-          <w:sz w:val="24"/>
-          <w:szCs w:val="24"/>
-        </w:rPr>
-      </w:pPr>
-      <w:r>
-        <w:rPr>
-          <w:rFonts w:asciiTheme="minorHAnsi" w:hAnsiTheme="minorHAnsi" w:cstheme="minorHAnsi"/>
-          <w:sz w:val="24"/>
-          <w:szCs w:val="24"/>
-        </w:rPr>
-        <w:t>a)  Sketch or describe the locations of the baseband spectrum and the first two pairs of replicas after ideal sampling.</w:t>
-      </w:r>
-    </w:p>
-    <w:p>
-      <w:pPr>
-        <w:pStyle w:val="ListNumber2"/>
-        <w:numPr>
-          <w:ilvl w:val="0"/>
-          <w:numId w:val="0"/>
-        </w:numPr>
-        <w:spacing w:after="80"/>
-        <w:rPr>
-          <w:rFonts w:asciiTheme="minorHAnsi" w:hAnsiTheme="minorHAnsi" w:cstheme="minorHAnsi"/>
-          <w:sz w:val="24"/>
-          <w:szCs w:val="24"/>
-        </w:rPr>
-      </w:pPr>
-      <w:r>
-        <w:rPr>
-          <w:rFonts w:asciiTheme="minorHAnsi" w:hAnsiTheme="minorHAnsi" w:cstheme="minorHAnsi"/>
-          <w:sz w:val="24"/>
-          <w:szCs w:val="24"/>
-        </w:rPr>
-        <w:t>b)  What is the separation between adjacent spectral replicas?</w:t>
-      </w:r>
-    </w:p>
-    <w:p>
-      <w:pPr>
-        <w:pStyle w:val="ListNumber2"/>
-        <w:numPr>
-          <w:ilvl w:val="0"/>
-          <w:numId w:val="0"/>
-        </w:numPr>
-        <w:spacing w:after="80"/>
-        <w:rPr>
-          <w:rFonts w:asciiTheme="minorHAnsi" w:hAnsiTheme="minorHAnsi" w:cstheme="minorHAnsi"/>
-          <w:sz w:val="24"/>
-          <w:szCs w:val="24"/>
-        </w:rPr>
-      </w:pPr>
-      <w:r>
-        <w:rPr>
-          <w:rFonts w:asciiTheme="minorHAnsi" w:hAnsiTheme="minorHAnsi" w:cstheme="minorHAnsi"/>
-          <w:sz w:val="24"/>
-          <w:szCs w:val="24"/>
-        </w:rPr>
-        <w:t xml:space="preserve">c)  What guard-band width exists between the positive edge of the baseband copy and the nearest edge of the </w:t>
-      </w:r>
-      <m:oMath>
-        <m:r>
-          <w:rPr>
-            <w:rFonts w:ascii="Cambria Math" w:hAnsi="Cambria Math" w:cstheme="minorHAnsi"/>
-            <w:sz w:val="24"/>
-            <w:szCs w:val="24"/>
-          </w:rPr>
-          <m:t>+</m:t>
-        </m:r>
-        <m:sSub>
-          <m:sSubPr>
-            <m:ctrlPr>
-              <w:rPr>
-                <w:rFonts w:ascii="Cambria Math" w:hAnsi="Cambria Math" w:cstheme="minorHAnsi"/>
-                <w:i/>
-                <w:sz w:val="24"/>
-                <w:szCs w:val="24"/>
-              </w:rPr>
-            </m:ctrlPr>
-          </m:sSubPr>
-          <m:e>
-            <m:r>
-              <w:rPr>
-                <w:rFonts w:ascii="Cambria Math" w:hAnsi="Cambria Math" w:cstheme="minorHAnsi"/>
-                <w:sz w:val="24"/>
-                <w:szCs w:val="24"/>
-              </w:rPr>
-              <m:t>f</m:t>
-            </m:r>
-          </m:e>
-          <m:sub>
-            <m:r>
-              <w:rPr>
-                <w:rFonts w:ascii="Cambria Math" w:hAnsi="Cambria Math" w:cstheme="minorHAnsi"/>
-                <w:sz w:val="24"/>
-                <w:szCs w:val="24"/>
-              </w:rPr>
-              <m:t>s</m:t>
-            </m:r>
-          </m:sub>
-        </m:sSub>
-      </m:oMath>
-      <w:r>
-        <w:rPr>
-          <w:rFonts w:asciiTheme="minorHAnsi" w:hAnsiTheme="minorHAnsi" w:cstheme="minorHAnsi"/>
-          <w:sz w:val="24"/>
-          <w:szCs w:val="24"/>
-        </w:rPr>
-        <w:t xml:space="preserve"> replica?</w:t>
-      </w:r>
-    </w:p>
-    <w:p>
-      <w:pPr>
-        <w:pStyle w:val="ListNumber2"/>
-        <w:numPr>
-          <w:ilvl w:val="0"/>
-          <w:numId w:val="0"/>
-        </w:numPr>
-        <w:spacing w:after="240"/>
-        <w:rPr>
-          <w:rFonts w:asciiTheme="minorHAnsi" w:hAnsiTheme="minorHAnsi" w:cstheme="minorHAnsi"/>
-          <w:sz w:val="24"/>
-          <w:szCs w:val="24"/>
-        </w:rPr>
-      </w:pPr>
-      <w:r>
-        <w:rPr>
-          <w:rFonts w:asciiTheme="minorHAnsi" w:hAnsiTheme="minorHAnsi" w:cstheme="minorHAnsi"/>
-          <w:sz w:val="24"/>
-          <w:szCs w:val="24"/>
-        </w:rPr>
-        <w:t>d)  What is the ideal Nyquist rate for this signal? Is 8 kHz above it?</w:t>
-      </w:r>
-    </w:p>
-    <w:p>
-      <w:pPr>
-        <w:spacing w:after="80"/>
-        <w:rPr>
-          <w:b/>
-          <w:bCs/>
-        </w:rPr>
-      </w:pPr>
-      <w:r>
-        <w:rPr>
-          <w:b/>
-          <w:bCs/>
-        </w:rPr>
-        <w:t xml:space="preserve">6. </w:t>
-      </w:r>
-      <w:proofErr w:type="spellStart"/>
-      <w:r>
-        <w:rPr>
-          <w:b/>
-          <w:bCs/>
-        </w:rPr>
-        <w:t>Downsampling</w:t>
-      </w:r>
-      <w:proofErr w:type="spellEnd"/>
-      <w:r>
-        <w:rPr>
-          <w:b/>
-          <w:bCs/>
-        </w:rPr>
-        <w:t xml:space="preserve"> audio: Filter first</w:t>
-      </w:r>
-    </w:p>
-    <w:p>
-      <w:pPr>
-        <w:spacing w:after="80"/>
-        <w:rPr>
-          <w:rFonts w:cstheme="minorHAnsi"/>
-        </w:rPr>
-      </w:pPr>
-      <w:r>
-        <w:rPr>
-          <w:rFonts w:cstheme="minorHAnsi"/>
-        </w:rPr>
-        <w:t xml:space="preserve">A recording is sampled at 48 kHz and contains useful content up to 18 kHz. You want a 16 kHz output by </w:t>
-      </w:r>
-      <w:proofErr w:type="spellStart"/>
-      <w:r>
-        <w:rPr>
-          <w:rFonts w:cstheme="minorHAnsi"/>
-        </w:rPr>
-        <w:t>downsampling</w:t>
-      </w:r>
-      <w:proofErr w:type="spellEnd"/>
-      <w:r>
-        <w:rPr>
-          <w:rFonts w:cstheme="minorHAnsi"/>
-        </w:rPr>
-        <w:t xml:space="preserve"> by 3.</w:t>
-      </w:r>
-    </w:p>
-    <w:p>
-      <w:pPr>
-        <w:pStyle w:val="ListNumber2"/>
-        <w:numPr>
-          <w:ilvl w:val="0"/>
-          <w:numId w:val="0"/>
-        </w:numPr>
-        <w:spacing w:after="80"/>
-        <w:rPr>
-          <w:rFonts w:asciiTheme="minorHAnsi" w:hAnsiTheme="minorHAnsi" w:cstheme="minorHAnsi"/>
-          <w:sz w:val="24"/>
-          <w:szCs w:val="24"/>
-        </w:rPr>
-      </w:pPr>
-      <w:r>
-        <w:rPr>
-          <w:rFonts w:asciiTheme="minorHAnsi" w:hAnsiTheme="minorHAnsi" w:cstheme="minorHAnsi"/>
-          <w:sz w:val="24"/>
-          <w:szCs w:val="24"/>
-        </w:rPr>
-        <w:t>a)  What is the new Nyquist frequency?</w:t>
-      </w:r>
-    </w:p>
-    <w:p>
-      <w:pPr>
-        <w:pStyle w:val="ListNumber2"/>
-        <w:numPr>
-          <w:ilvl w:val="0"/>
-          <w:numId w:val="0"/>
-        </w:numPr>
-        <w:spacing w:after="80"/>
-        <w:rPr>
-          <w:rFonts w:asciiTheme="minorHAnsi" w:hAnsiTheme="minorHAnsi" w:cstheme="minorHAnsi"/>
-          <w:sz w:val="24"/>
-          <w:szCs w:val="24"/>
-        </w:rPr>
-      </w:pPr>
-      <w:r>
-        <w:rPr>
-          <w:rFonts w:asciiTheme="minorHAnsi" w:hAnsiTheme="minorHAnsi" w:cstheme="minorHAnsi"/>
-          <w:sz w:val="24"/>
-          <w:szCs w:val="24"/>
-        </w:rPr>
-        <w:t>b)  Why is keeping every third sample without filtering incorrect?</w:t>
-      </w:r>
-    </w:p>
-    <w:p>
-      <w:pPr>
-        <w:pStyle w:val="ListNumber2"/>
-        <w:numPr>
-          <w:ilvl w:val="0"/>
-          <w:numId w:val="0"/>
-        </w:numPr>
-        <w:spacing w:after="80"/>
-        <w:rPr>
-          <w:rFonts w:asciiTheme="minorHAnsi" w:hAnsiTheme="minorHAnsi" w:cstheme="minorHAnsi"/>
-          <w:sz w:val="24"/>
-          <w:szCs w:val="24"/>
-        </w:rPr>
-      </w:pPr>
-      <w:r>
-        <w:rPr>
-          <w:rFonts w:asciiTheme="minorHAnsi" w:hAnsiTheme="minorHAnsi" w:cstheme="minorHAnsi"/>
-          <w:sz w:val="24"/>
-          <w:szCs w:val="24"/>
-        </w:rPr>
-        <w:t xml:space="preserve">c)  What band must be strongly attenuated before </w:t>
-      </w:r>
-      <w:proofErr w:type="spellStart"/>
-      <w:r>
-        <w:rPr>
-          <w:rFonts w:asciiTheme="minorHAnsi" w:hAnsiTheme="minorHAnsi" w:cstheme="minorHAnsi"/>
-          <w:sz w:val="24"/>
-          <w:szCs w:val="24"/>
-        </w:rPr>
-        <w:t>downsampling</w:t>
-      </w:r>
-      <w:proofErr w:type="spellEnd"/>
-      <w:r>
-        <w:rPr>
-          <w:rFonts w:asciiTheme="minorHAnsi" w:hAnsiTheme="minorHAnsi" w:cstheme="minorHAnsi"/>
-          <w:sz w:val="24"/>
-          <w:szCs w:val="24"/>
-        </w:rPr>
-        <w:t>?</w:t>
-      </w:r>
-    </w:p>
-    <w:p>
-      <w:pPr>
-        <w:pStyle w:val="ListNumber2"/>
-        <w:numPr>
-          <w:ilvl w:val="0"/>
-          <w:numId w:val="0"/>
-        </w:numPr>
-        <w:spacing w:after="240"/>
-        <w:rPr>
-          <w:rFonts w:asciiTheme="minorHAnsi" w:hAnsiTheme="minorHAnsi" w:cstheme="minorHAnsi"/>
-          <w:sz w:val="24"/>
-          <w:szCs w:val="24"/>
-        </w:rPr>
-      </w:pPr>
-      <w:r>
-        <w:rPr>
-          <w:rFonts w:asciiTheme="minorHAnsi" w:hAnsiTheme="minorHAnsi" w:cstheme="minorHAnsi"/>
-          <w:sz w:val="24"/>
-          <w:szCs w:val="24"/>
-        </w:rPr>
-        <w:t xml:space="preserve">d)  If an 11 kHz sinusoid is present and you </w:t>
-      </w:r>
-      <w:proofErr w:type="spellStart"/>
-      <w:r>
-        <w:rPr>
-          <w:rFonts w:asciiTheme="minorHAnsi" w:hAnsiTheme="minorHAnsi" w:cstheme="minorHAnsi"/>
-          <w:sz w:val="24"/>
-          <w:szCs w:val="24"/>
-        </w:rPr>
-        <w:t>downsample</w:t>
-      </w:r>
-      <w:proofErr w:type="spellEnd"/>
-      <w:r>
-        <w:rPr>
-          <w:rFonts w:asciiTheme="minorHAnsi" w:hAnsiTheme="minorHAnsi" w:cstheme="minorHAnsi"/>
-          <w:sz w:val="24"/>
-          <w:szCs w:val="24"/>
-        </w:rPr>
-        <w:t xml:space="preserve"> naively to 16 kHz, at what frequency does it appear?</w:t>
-      </w:r>
-    </w:p>
-    <w:p>
-      <w:pPr>
-        <w:spacing w:after="80"/>
-        <w:rPr>
-          <w:b/>
-          <w:bCs/>
-        </w:rPr>
-      </w:pPr>
-      <w:r>
-        <w:rPr>
-          <w:b/>
-          <w:bCs/>
-        </w:rPr>
-        <w:t>7. Prove two analog sinusoids give the same samples (ECEN 5632 problem)</w:t>
-      </w:r>
-    </w:p>
-    <w:p>
-      <w:pPr>
-        <w:spacing w:after="80"/>
-        <w:rPr>
-          <w:rFonts w:cstheme="minorHAnsi"/>
-        </w:rPr>
-      </w:pPr>
-      <w:r>
-        <w:rPr>
-          <w:rFonts w:cstheme="minorHAnsi"/>
-        </w:rPr>
-        <w:t xml:space="preserve">At </w:t>
+        <w:t>.</w:t>
+      </w:r>
+    </w:p>
+    <w:p>
+      <w:pPr>
+        <w:spacing w:after="200"/>
+      </w:pPr>
+      <w:r>
+        <w:t xml:space="preserve">c)  Compute </w:t>
       </w:r>
       <m:oMath>
         <m:sSub>
           <m:sSubPr>
             <m:ctrlPr>
               <w:rPr>
-                <w:rFonts w:ascii="Cambria Math" w:hAnsi="Cambria Math" w:cstheme="minorHAnsi"/>
+                <w:rFonts w:ascii="Cambria Math" w:hAnsi="Cambria Math"/>
                 <w:i/>
               </w:rPr>
             </m:ctrlPr>
@@ -1628,39 +430,60 @@
           <m:e>
             <m:r>
               <w:rPr>
-                <w:rFonts w:ascii="Cambria Math" w:hAnsi="Cambria Math" w:cstheme="minorHAnsi"/>
+                <w:rFonts w:ascii="Cambria Math" w:hAnsi="Cambria Math"/>
               </w:rPr>
-              <m:t>f</m:t>
+              <m:t>x</m:t>
             </m:r>
           </m:e>
           <m:sub>
             <m:r>
               <w:rPr>
-                <w:rFonts w:ascii="Cambria Math" w:hAnsi="Cambria Math" w:cstheme="minorHAnsi"/>
+                <w:rFonts w:ascii="Cambria Math" w:hAnsi="Cambria Math"/>
               </w:rPr>
-              <m:t>s</m:t>
+              <m:t>r</m:t>
             </m:r>
           </m:sub>
         </m:sSub>
         <m:r>
           <w:rPr>
-            <w:rFonts w:ascii="Cambria Math" w:hAnsi="Cambria Math" w:cstheme="minorHAnsi"/>
-          </w:rPr>
-          <m:t xml:space="preserve"> = 12</m:t>
+            <w:rFonts w:ascii="Cambria Math" w:hAnsi="Cambria Math"/>
+          </w:rPr>
+          <m:t>(T/2)</m:t>
         </m:r>
       </m:oMath>
       <w:r>
-        <w:rPr>
-          <w:rFonts w:cstheme="minorHAnsi"/>
-        </w:rPr>
-        <w:t xml:space="preserve"> kHz, compare </w:t>
+        <w:t>.</w:t>
+      </w:r>
+    </w:p>
+    <w:p>
+      <w:pPr>
+        <w:spacing w:after="80"/>
+        <w:rPr>
+          <w:b/>
+          <w:bCs/>
+        </w:rPr>
+      </w:pPr>
+      <w:r>
+        <w:rPr>
+          <w:b/>
+          <w:bCs/>
+        </w:rPr>
+        <w:t>2. Zero-order hold frequency response</w:t>
+      </w:r>
+    </w:p>
+    <w:p>
+      <w:pPr>
+        <w:spacing w:after="80"/>
+      </w:pPr>
+      <w:r>
+        <w:t xml:space="preserve">A DAC uses a zero-order hold </w:t>
       </w:r>
       <m:oMath>
         <m:sSub>
           <m:sSubPr>
             <m:ctrlPr>
               <w:rPr>
-                <w:rFonts w:ascii="Cambria Math" w:hAnsi="Cambria Math" w:cstheme="minorHAnsi"/>
+                <w:rFonts w:ascii="Cambria Math" w:hAnsi="Cambria Math"/>
                 <w:i/>
               </w:rPr>
             </m:ctrlPr>
@@ -1668,54 +491,44 @@
           <m:e>
             <m:r>
               <w:rPr>
-                <w:rFonts w:ascii="Cambria Math" w:hAnsi="Cambria Math" w:cstheme="minorHAnsi"/>
+                <w:rFonts w:ascii="Cambria Math" w:hAnsi="Cambria Math"/>
               </w:rPr>
-              <m:t>x</m:t>
+              <m:t>h</m:t>
             </m:r>
           </m:e>
           <m:sub>
             <m:r>
               <w:rPr>
-                <w:rFonts w:ascii="Cambria Math" w:hAnsi="Cambria Math" w:cstheme="minorHAnsi"/>
+                <w:rFonts w:ascii="Cambria Math" w:hAnsi="Cambria Math"/>
               </w:rPr>
-              <m:t>1</m:t>
+              <m:t>ZOH</m:t>
             </m:r>
           </m:sub>
         </m:sSub>
         <m:r>
           <w:rPr>
-            <w:rFonts w:ascii="Cambria Math" w:hAnsi="Cambria Math" w:cstheme="minorHAnsi"/>
-          </w:rPr>
-          <m:t>(t)=</m:t>
-        </m:r>
-        <m:r>
-          <m:rPr>
-            <m:sty m:val="p"/>
-          </m:rPr>
-          <w:rPr>
-            <w:rFonts w:ascii="Cambria Math" w:hAnsi="Cambria Math" w:cstheme="minorHAnsi"/>
-          </w:rPr>
-          <m:t>cos</m:t>
-        </m:r>
-        <m:r>
-          <w:rPr>
-            <w:rFonts w:ascii="Cambria Math" w:hAnsi="Cambria Math" w:cstheme="minorHAnsi"/>
-          </w:rPr>
-          <m:t>(2π·2000t)</m:t>
+            <w:rFonts w:ascii="Cambria Math" w:hAnsi="Cambria Math"/>
+          </w:rPr>
+          <m:t>(t)=u(t)-u(t-T)</m:t>
         </m:r>
       </m:oMath>
       <w:r>
-        <w:rPr>
-          <w:rFonts w:cstheme="minorHAnsi"/>
-        </w:rPr>
-        <w:t xml:space="preserve"> and </w:t>
+        <w:t>.</w:t>
+      </w:r>
+    </w:p>
+    <w:p>
+      <w:pPr>
+        <w:spacing w:after="80"/>
+      </w:pPr>
+      <w:r>
+        <w:t xml:space="preserve">a)  Derive </w:t>
       </w:r>
       <m:oMath>
         <m:sSub>
           <m:sSubPr>
             <m:ctrlPr>
               <w:rPr>
-                <w:rFonts w:ascii="Cambria Math" w:hAnsi="Cambria Math" w:cstheme="minorHAnsi"/>
+                <w:rFonts w:ascii="Cambria Math" w:hAnsi="Cambria Math"/>
                 <w:i/>
               </w:rPr>
             </m:ctrlPr>
@@ -1723,366 +536,550 @@
           <m:e>
             <m:r>
               <w:rPr>
-                <w:rFonts w:ascii="Cambria Math" w:hAnsi="Cambria Math" w:cstheme="minorHAnsi"/>
+                <w:rFonts w:ascii="Cambria Math" w:hAnsi="Cambria Math"/>
               </w:rPr>
-              <m:t>x</m:t>
+              <m:t>H</m:t>
             </m:r>
           </m:e>
           <m:sub>
             <m:r>
               <w:rPr>
-                <w:rFonts w:ascii="Cambria Math" w:hAnsi="Cambria Math" w:cstheme="minorHAnsi"/>
+                <w:rFonts w:ascii="Cambria Math" w:hAnsi="Cambria Math"/>
               </w:rPr>
-              <m:t>2</m:t>
+              <m:t>ZOH</m:t>
             </m:r>
           </m:sub>
         </m:sSub>
         <m:r>
           <w:rPr>
-            <w:rFonts w:ascii="Cambria Math" w:hAnsi="Cambria Math" w:cstheme="minorHAnsi"/>
-          </w:rPr>
-          <m:t>(t)=</m:t>
-        </m:r>
-        <m:r>
-          <m:rPr>
-            <m:sty m:val="p"/>
-          </m:rPr>
-          <w:rPr>
-            <w:rFonts w:ascii="Cambria Math" w:hAnsi="Cambria Math" w:cstheme="minorHAnsi"/>
-          </w:rPr>
-          <m:t>cos</m:t>
-        </m:r>
-        <m:r>
-          <w:rPr>
-            <w:rFonts w:ascii="Cambria Math" w:hAnsi="Cambria Math" w:cstheme="minorHAnsi"/>
-          </w:rPr>
-          <m:t>(2π·10000t)</m:t>
+            <w:rFonts w:ascii="Cambria Math" w:hAnsi="Cambria Math"/>
+          </w:rPr>
+          <m:t>(jΩ)</m:t>
         </m:r>
       </m:oMath>
       <w:r>
-        <w:rPr>
-          <w:rFonts w:cstheme="minorHAnsi"/>
-        </w:rPr>
-        <w:t>.</w:t>
-      </w:r>
-    </w:p>
-    <w:p>
-      <w:pPr>
-        <w:pStyle w:val="ListNumber2"/>
-        <w:numPr>
-          <w:ilvl w:val="0"/>
-          <w:numId w:val="0"/>
-        </w:numPr>
+        <w:t xml:space="preserve"> by direct integration.</w:t>
+      </w:r>
+    </w:p>
+    <w:p>
+      <w:pPr>
         <w:spacing w:after="80"/>
-        <w:rPr>
-          <w:rFonts w:asciiTheme="minorHAnsi" w:hAnsiTheme="minorHAnsi" w:cstheme="minorHAnsi"/>
-          <w:sz w:val="24"/>
-          <w:szCs w:val="24"/>
-        </w:rPr>
-      </w:pPr>
-      <w:r>
-        <w:rPr>
-          <w:rFonts w:asciiTheme="minorHAnsi" w:hAnsiTheme="minorHAnsi" w:cstheme="minorHAnsi"/>
-          <w:sz w:val="24"/>
-          <w:szCs w:val="24"/>
-        </w:rPr>
-        <w:t xml:space="preserve">a)  Write </w:t>
+      </w:pPr>
+      <w:r>
+        <w:t xml:space="preserve">b)  Separate the result into a linear-phase term and a </w:t>
+      </w:r>
+      <w:proofErr w:type="spellStart"/>
+      <w:r>
+        <w:t>sinc</w:t>
+      </w:r>
+      <w:proofErr w:type="spellEnd"/>
+      <w:r>
+        <w:t>-like magnitude term.</w:t>
+      </w:r>
+    </w:p>
+    <w:p>
+      <w:pPr>
+        <w:spacing w:after="200"/>
+      </w:pPr>
+      <w:r>
+        <w:t xml:space="preserve">c)  Compute the normalized magnitude </w:t>
       </w:r>
       <m:oMath>
+        <m:r>
+          <w:rPr>
+            <w:rFonts w:ascii="Cambria Math" w:hAnsi="Cambria Math"/>
+          </w:rPr>
+          <m:t>|</m:t>
+        </m:r>
         <m:sSub>
           <m:sSubPr>
             <m:ctrlPr>
               <w:rPr>
-                <w:rFonts w:ascii="Cambria Math" w:hAnsi="Cambria Math" w:cstheme="minorHAnsi"/>
+                <w:rFonts w:ascii="Cambria Math" w:hAnsi="Cambria Math"/>
                 <w:i/>
-                <w:sz w:val="24"/>
-                <w:szCs w:val="24"/>
               </w:rPr>
             </m:ctrlPr>
           </m:sSubPr>
           <m:e>
             <m:r>
               <w:rPr>
-                <w:rFonts w:ascii="Cambria Math" w:hAnsi="Cambria Math" w:cstheme="minorHAnsi"/>
-                <w:sz w:val="24"/>
-                <w:szCs w:val="24"/>
+                <w:rFonts w:ascii="Cambria Math" w:hAnsi="Cambria Math"/>
               </w:rPr>
-              <m:t>x</m:t>
+              <m:t>H</m:t>
             </m:r>
           </m:e>
           <m:sub>
             <m:r>
               <w:rPr>
-                <w:rFonts w:ascii="Cambria Math" w:hAnsi="Cambria Math" w:cstheme="minorHAnsi"/>
-                <w:sz w:val="24"/>
-                <w:szCs w:val="24"/>
+                <w:rFonts w:ascii="Cambria Math" w:hAnsi="Cambria Math"/>
               </w:rPr>
-              <m:t>1</m:t>
+              <m:t>ZOH</m:t>
             </m:r>
           </m:sub>
         </m:sSub>
         <m:r>
           <w:rPr>
-            <w:rFonts w:ascii="Cambria Math" w:hAnsi="Cambria Math" w:cstheme="minorHAnsi"/>
-            <w:sz w:val="24"/>
-            <w:szCs w:val="24"/>
-          </w:rPr>
-          <m:t>[n]</m:t>
+            <w:rFonts w:ascii="Cambria Math" w:hAnsi="Cambria Math"/>
+          </w:rPr>
+          <m:t>|/T</m:t>
         </m:r>
       </m:oMath>
       <w:r>
-        <w:rPr>
-          <w:rFonts w:asciiTheme="minorHAnsi" w:hAnsiTheme="minorHAnsi" w:cstheme="minorHAnsi"/>
-          <w:sz w:val="24"/>
-          <w:szCs w:val="24"/>
-        </w:rPr>
-        <w:t xml:space="preserve"> and </w:t>
+        <w:t xml:space="preserve"> in dB at </w:t>
       </w:r>
       <m:oMath>
-        <m:sSub>
-          <m:sSubPr>
+        <m:r>
+          <w:rPr>
+            <w:rFonts w:ascii="Cambria Math" w:hAnsi="Cambria Math"/>
+          </w:rPr>
+          <m:t>ω=ΩT=0.5π</m:t>
+        </m:r>
+      </m:oMath>
+      <w:r>
+        <w:t xml:space="preserve"> and at </w:t>
+      </w:r>
+      <m:oMath>
+        <m:r>
+          <w:rPr>
+            <w:rFonts w:ascii="Cambria Math" w:hAnsi="Cambria Math"/>
+          </w:rPr>
+          <m:t>ω=π</m:t>
+        </m:r>
+      </m:oMath>
+      <w:r>
+        <w:t>.</w:t>
+      </w:r>
+    </w:p>
+    <w:p>
+      <w:pPr>
+        <w:spacing w:after="80"/>
+        <w:rPr>
+          <w:b/>
+          <w:bCs/>
+        </w:rPr>
+      </w:pPr>
+      <w:r>
+        <w:rPr>
+          <w:b/>
+          <w:bCs/>
+        </w:rPr>
+        <w:t>3. Uniform quantization and SQNR</w:t>
+      </w:r>
+    </w:p>
+    <w:p>
+      <w:pPr>
+        <w:spacing w:after="80"/>
+      </w:pPr>
+      <w:r>
+        <w:t>A uniform B-bit quantizer spans approximately −1 V to +1 V. Assume the high-resolution uniform-error model when requested.</w:t>
+      </w:r>
+    </w:p>
+    <w:p>
+      <w:pPr>
+        <w:spacing w:after="80"/>
+      </w:pPr>
+      <w:r>
+        <w:t xml:space="preserve">a)  For </w:t>
+      </w:r>
+      <m:oMath>
+        <m:r>
+          <w:rPr>
+            <w:rFonts w:ascii="Cambria Math" w:hAnsi="Cambria Math"/>
+          </w:rPr>
+          <m:t>B=8</m:t>
+        </m:r>
+      </m:oMath>
+      <w:r>
+        <w:t xml:space="preserve">, find the quantization step </w:t>
+      </w:r>
+      <m:oMath>
+        <m:r>
+          <w:rPr>
+            <w:rFonts w:ascii="Cambria Math" w:hAnsi="Cambria Math"/>
+          </w:rPr>
+          <m:t>Δ</m:t>
+        </m:r>
+      </m:oMath>
+      <w:r>
+        <w:t>.</w:t>
+      </w:r>
+    </w:p>
+    <w:p>
+      <w:pPr>
+        <w:spacing w:after="80"/>
+      </w:pPr>
+      <w:r>
+        <w:t xml:space="preserve">b)  Find the modeled error variance </w:t>
+      </w:r>
+      <m:oMath>
+        <m:sSubSup>
+          <m:sSubSupPr>
             <m:ctrlPr>
               <w:rPr>
-                <w:rFonts w:ascii="Cambria Math" w:hAnsi="Cambria Math" w:cstheme="minorHAnsi"/>
+                <w:rFonts w:ascii="Cambria Math" w:hAnsi="Cambria Math"/>
                 <w:i/>
-                <w:sz w:val="24"/>
-                <w:szCs w:val="24"/>
               </w:rPr>
             </m:ctrlPr>
-          </m:sSubPr>
+          </m:sSubSupPr>
           <m:e>
             <m:r>
               <w:rPr>
-                <w:rFonts w:ascii="Cambria Math" w:hAnsi="Cambria Math" w:cstheme="minorHAnsi"/>
-                <w:sz w:val="24"/>
-                <w:szCs w:val="24"/>
+                <w:rFonts w:ascii="Cambria Math" w:hAnsi="Cambria Math"/>
               </w:rPr>
-              <m:t>x</m:t>
+              <m:t>σ</m:t>
             </m:r>
           </m:e>
           <m:sub>
             <m:r>
               <w:rPr>
-                <w:rFonts w:ascii="Cambria Math" w:hAnsi="Cambria Math" w:cstheme="minorHAnsi"/>
-                <w:sz w:val="24"/>
-                <w:szCs w:val="24"/>
+                <w:rFonts w:ascii="Cambria Math" w:hAnsi="Cambria Math"/>
+              </w:rPr>
+              <m:t>e</m:t>
+            </m:r>
+          </m:sub>
+          <m:sup>
+            <m:r>
+              <w:rPr>
+                <w:rFonts w:ascii="Cambria Math" w:hAnsi="Cambria Math"/>
               </w:rPr>
               <m:t>2</m:t>
             </m:r>
-          </m:sub>
-        </m:sSub>
-        <m:r>
-          <w:rPr>
-            <w:rFonts w:ascii="Cambria Math" w:hAnsi="Cambria Math" w:cstheme="minorHAnsi"/>
-            <w:sz w:val="24"/>
-            <w:szCs w:val="24"/>
-          </w:rPr>
-          <m:t>[n]</m:t>
+          </m:sup>
+        </m:sSubSup>
+        <m:r>
+          <w:rPr>
+            <w:rFonts w:ascii="Cambria Math" w:hAnsi="Cambria Math"/>
+          </w:rPr>
+          <m:t>=Δ²/12</m:t>
         </m:r>
       </m:oMath>
       <w:r>
-        <w:rPr>
-          <w:rFonts w:asciiTheme="minorHAnsi" w:hAnsiTheme="minorHAnsi" w:cstheme="minorHAnsi"/>
-          <w:sz w:val="24"/>
-          <w:szCs w:val="24"/>
-        </w:rPr>
+        <w:t xml:space="preserve"> and RMS quantization error.</w:t>
+      </w:r>
+    </w:p>
+    <w:p>
+      <w:pPr>
+        <w:spacing w:after="80"/>
+      </w:pPr>
+      <w:r>
+        <w:t>c)  Estimate the SQNR of a full-scale 8-bit sine.</w:t>
+      </w:r>
+    </w:p>
+    <w:p>
+      <w:pPr>
+        <w:spacing w:after="80"/>
+      </w:pPr>
+      <w:r>
+        <w:t>d)  Estimate the full-</w:t>
+      </w:r>
+      <w:proofErr w:type="gramStart"/>
+      <w:r>
+        <w:t>scale sine</w:t>
+      </w:r>
+      <w:proofErr w:type="gramEnd"/>
+      <w:r>
+        <w:t xml:space="preserve"> SQNR for 16 bits.</w:t>
+      </w:r>
+    </w:p>
+    <w:p>
+      <w:pPr>
+        <w:spacing w:after="200"/>
+      </w:pPr>
+      <w:r>
+        <w:t>e)  Explain why “16-bit audio is about 96 dB” and “16-bit full-scale sine SQNR is about 98 dB” are not necessarily contradictory</w:t>
+      </w:r>
+    </w:p>
+    <w:p>
+      <w:pPr>
+        <w:spacing w:after="80"/>
+        <w:rPr>
+          <w:b/>
+          <w:bCs/>
+        </w:rPr>
+      </w:pPr>
+      <w:r>
+        <w:rPr>
+          <w:b/>
+          <w:bCs/>
+        </w:rPr>
+        <w:t>4. Finite sequence z-transform</w:t>
+      </w:r>
+    </w:p>
+    <w:p>
+      <w:pPr>
+        <w:spacing w:after="200"/>
+      </w:pPr>
+      <w:r>
+        <w:t xml:space="preserve">Let </w:t>
+      </w:r>
+      <m:oMath>
+        <m:r>
+          <w:rPr>
+            <w:rFonts w:ascii="Cambria Math" w:hAnsi="Cambria Math"/>
+          </w:rPr>
+          <m:t>x[n] = 2δ[n+1] - δ[n] + 3δ[n-2]</m:t>
+        </m:r>
+      </m:oMath>
+      <w:r>
+        <w:t xml:space="preserve">. Find </w:t>
+      </w:r>
+      <m:oMath>
+        <m:r>
+          <w:rPr>
+            <w:rFonts w:ascii="Cambria Math" w:hAnsi="Cambria Math"/>
+          </w:rPr>
+          <m:t>X(z)</m:t>
+        </m:r>
+      </m:oMath>
+      <w:r>
+        <w:t>, state the ROC, and determine whether the DTFT exists.</w:t>
+      </w:r>
+    </w:p>
+    <w:p>
+      <w:pPr>
+        <w:spacing w:after="80"/>
+        <w:rPr>
+          <w:b/>
+          <w:bCs/>
+        </w:rPr>
+      </w:pPr>
+    </w:p>
+    <w:p>
+      <w:pPr>
+        <w:spacing w:after="80"/>
+        <w:rPr>
+          <w:b/>
+          <w:bCs/>
+        </w:rPr>
+      </w:pPr>
+      <w:r>
+        <w:rPr>
+          <w:b/>
+          <w:bCs/>
+        </w:rPr>
+        <w:lastRenderedPageBreak/>
+        <w:t>5. Right-sided exponential and convergence</w:t>
+      </w:r>
+    </w:p>
+    <w:p>
+      <w:pPr>
+        <w:spacing w:after="200"/>
+      </w:pPr>
+      <w:r>
+        <w:t xml:space="preserve">For </w:t>
+      </w:r>
+      <m:oMath>
+        <m:r>
+          <w:rPr>
+            <w:rFonts w:ascii="Cambria Math" w:hAnsi="Cambria Math"/>
+          </w:rPr>
+          <m:t>x[n]=(1.2)ⁿ u[n]</m:t>
+        </m:r>
+      </m:oMath>
+      <w:r>
+        <w:t xml:space="preserve">, derive </w:t>
+      </w:r>
+      <m:oMath>
+        <m:r>
+          <w:rPr>
+            <w:rFonts w:ascii="Cambria Math" w:hAnsi="Cambria Math"/>
+          </w:rPr>
+          <m:t>X(z)</m:t>
+        </m:r>
+      </m:oMath>
+      <w:r>
+        <w:t xml:space="preserve"> from the geometric series, state the ROC, identify the pole, and determine whether its DTFT exists.</w:t>
+      </w:r>
+    </w:p>
+    <w:p>
+      <w:pPr>
+        <w:spacing w:after="80"/>
+        <w:rPr>
+          <w:b/>
+          <w:bCs/>
+        </w:rPr>
+      </w:pPr>
+      <w:r>
+        <w:rPr>
+          <w:b/>
+          <w:bCs/>
+        </w:rPr>
+        <w:t>6. Same algebra, different ROC</w:t>
+      </w:r>
+    </w:p>
+    <w:p>
+      <w:pPr>
+        <w:spacing w:after="80"/>
+      </w:pPr>
+      <w:r>
+        <w:t xml:space="preserve">Find the inverse z-transform of </w:t>
+      </w:r>
+      <m:oMath>
+        <m:r>
+          <w:rPr>
+            <w:rFonts w:ascii="Cambria Math" w:hAnsi="Cambria Math"/>
+          </w:rPr>
+          <m:t>X(z)=1/(1-0.75z⁻¹)</m:t>
+        </m:r>
+      </m:oMath>
+      <w:r>
+        <w:t xml:space="preserve"> for</w:t>
+      </w:r>
+    </w:p>
+    <w:p>
+      <w:pPr>
+        <w:spacing w:after="80"/>
+      </w:pPr>
+      <w:r>
+        <w:t xml:space="preserve">a) </w:t>
+      </w:r>
+      <m:oMath>
+        <m:r>
+          <w:rPr>
+            <w:rFonts w:ascii="Cambria Math" w:hAnsi="Cambria Math"/>
+          </w:rPr>
+          <m:t>|z|&gt;0.75</m:t>
+        </m:r>
+      </m:oMath>
+      <w:r>
+        <w:t xml:space="preserve"> and</w:t>
+      </w:r>
+    </w:p>
+    <w:p>
+      <w:pPr>
+        <w:spacing w:after="80"/>
+      </w:pPr>
+      <w:r>
+        <w:t xml:space="preserve">b) </w:t>
+      </w:r>
+      <m:oMath>
+        <m:r>
+          <w:rPr>
+            <w:rFonts w:ascii="Cambria Math" w:hAnsi="Cambria Math"/>
+          </w:rPr>
+          <m:t>|z|&lt;0.75</m:t>
+        </m:r>
+      </m:oMath>
+      <w:r>
         <w:t>.</w:t>
       </w:r>
     </w:p>
     <w:p>
       <w:pPr>
-        <w:pStyle w:val="ListNumber2"/>
-        <w:numPr>
-          <w:ilvl w:val="0"/>
-          <w:numId w:val="0"/>
-        </w:numPr>
+        <w:spacing w:after="200"/>
+      </w:pPr>
+      <w:r>
+        <w:t>Explain in one sentence why the two answers can have the same rational expression.</w:t>
+      </w:r>
+    </w:p>
+    <w:p>
+      <w:pPr>
         <w:spacing w:after="80"/>
         <w:rPr>
-          <w:rFonts w:asciiTheme="minorHAnsi" w:hAnsiTheme="minorHAnsi" w:cstheme="minorHAnsi"/>
-          <w:sz w:val="24"/>
-          <w:szCs w:val="24"/>
-        </w:rPr>
-      </w:pPr>
-      <w:r>
-        <w:rPr>
-          <w:rFonts w:asciiTheme="minorHAnsi" w:hAnsiTheme="minorHAnsi" w:cstheme="minorHAnsi"/>
-          <w:sz w:val="24"/>
-          <w:szCs w:val="24"/>
-        </w:rPr>
-        <w:t xml:space="preserve">b)  Use a trigonometric or complex-exponential identity to prove </w:t>
+          <w:b/>
+          <w:bCs/>
+        </w:rPr>
+      </w:pPr>
+      <w:r>
+        <w:rPr>
+          <w:b/>
+          <w:bCs/>
+        </w:rPr>
+        <w:t>7.</w:t>
+      </w:r>
+      <w:r>
+        <w:rPr>
+          <w:b/>
+          <w:bCs/>
+        </w:rPr>
+        <w:t xml:space="preserve"> Partial fractions with two ROCs</w:t>
+      </w:r>
+      <w:r>
+        <w:rPr>
+          <w:b/>
+          <w:bCs/>
+        </w:rPr>
+        <w:t xml:space="preserve"> (ECEN 5632 Problem)</w:t>
+      </w:r>
+    </w:p>
+    <w:p>
+      <w:pPr>
+        <w:spacing w:after="80"/>
+      </w:pPr>
+      <w:r>
+        <w:t xml:space="preserve">Let </w:t>
       </w:r>
       <m:oMath>
-        <m:sSub>
-          <m:sSubPr>
-            <m:ctrlPr>
-              <w:rPr>
-                <w:rFonts w:ascii="Cambria Math" w:hAnsi="Cambria Math" w:cstheme="minorHAnsi"/>
-                <w:i/>
-                <w:sz w:val="24"/>
-                <w:szCs w:val="24"/>
-              </w:rPr>
-            </m:ctrlPr>
-          </m:sSubPr>
-          <m:e>
-            <m:r>
-              <w:rPr>
-                <w:rFonts w:ascii="Cambria Math" w:hAnsi="Cambria Math" w:cstheme="minorHAnsi"/>
-                <w:sz w:val="24"/>
-                <w:szCs w:val="24"/>
-              </w:rPr>
-              <m:t>x</m:t>
-            </m:r>
-          </m:e>
-          <m:sub>
-            <m:r>
-              <w:rPr>
-                <w:rFonts w:ascii="Cambria Math" w:hAnsi="Cambria Math" w:cstheme="minorHAnsi"/>
-                <w:sz w:val="24"/>
-                <w:szCs w:val="24"/>
-              </w:rPr>
-              <m:t>1</m:t>
-            </m:r>
-          </m:sub>
-        </m:sSub>
-        <m:r>
-          <w:rPr>
-            <w:rFonts w:ascii="Cambria Math" w:hAnsi="Cambria Math" w:cstheme="minorHAnsi"/>
-            <w:sz w:val="24"/>
-            <w:szCs w:val="24"/>
-          </w:rPr>
-          <m:t>[n]=</m:t>
-        </m:r>
-        <m:sSub>
-          <m:sSubPr>
-            <m:ctrlPr>
-              <w:rPr>
-                <w:rFonts w:ascii="Cambria Math" w:hAnsi="Cambria Math" w:cstheme="minorHAnsi"/>
-                <w:i/>
-                <w:sz w:val="24"/>
-                <w:szCs w:val="24"/>
-              </w:rPr>
-            </m:ctrlPr>
-          </m:sSubPr>
-          <m:e>
-            <m:r>
-              <w:rPr>
-                <w:rFonts w:ascii="Cambria Math" w:hAnsi="Cambria Math" w:cstheme="minorHAnsi"/>
-                <w:sz w:val="24"/>
-                <w:szCs w:val="24"/>
-              </w:rPr>
-              <m:t>x</m:t>
-            </m:r>
-          </m:e>
-          <m:sub>
-            <m:r>
-              <w:rPr>
-                <w:rFonts w:ascii="Cambria Math" w:hAnsi="Cambria Math" w:cstheme="minorHAnsi"/>
-                <w:sz w:val="24"/>
-                <w:szCs w:val="24"/>
-              </w:rPr>
-              <m:t>2</m:t>
-            </m:r>
-          </m:sub>
-        </m:sSub>
-        <m:r>
-          <w:rPr>
-            <w:rFonts w:ascii="Cambria Math" w:hAnsi="Cambria Math" w:cstheme="minorHAnsi"/>
-            <w:sz w:val="24"/>
-            <w:szCs w:val="24"/>
-          </w:rPr>
-          <m:t>[n]</m:t>
+        <m:r>
+          <w:rPr>
+            <w:rFonts w:ascii="Cambria Math" w:hAnsi="Cambria Math"/>
+          </w:rPr>
+          <m:t>X(z)=1/[(1-0.5z⁻¹)(1-0.8z⁻¹)]</m:t>
         </m:r>
       </m:oMath>
       <w:r>
-        <w:rPr>
-          <w:rFonts w:asciiTheme="minorHAnsi" w:hAnsiTheme="minorHAnsi" w:cstheme="minorHAnsi"/>
-          <w:sz w:val="24"/>
-          <w:szCs w:val="24"/>
-        </w:rPr>
-        <w:t xml:space="preserve"> for every integer </w:t>
+        <w:t xml:space="preserve">. Use partial fractions and find </w:t>
       </w:r>
       <m:oMath>
         <m:r>
           <w:rPr>
-            <w:rFonts w:ascii="Cambria Math" w:hAnsi="Cambria Math" w:cstheme="minorHAnsi"/>
-            <w:sz w:val="24"/>
-            <w:szCs w:val="24"/>
-          </w:rPr>
-          <m:t>n</m:t>
+            <w:rFonts w:ascii="Cambria Math" w:hAnsi="Cambria Math"/>
+          </w:rPr>
+          <m:t>x[n]</m:t>
         </m:r>
       </m:oMath>
       <w:r>
-        <w:rPr>
-          <w:rFonts w:asciiTheme="minorHAnsi" w:hAnsiTheme="minorHAnsi" w:cstheme="minorHAnsi"/>
-          <w:sz w:val="24"/>
-          <w:szCs w:val="24"/>
-        </w:rPr>
+        <w:t xml:space="preserve"> for</w:t>
+      </w:r>
+    </w:p>
+    <w:p>
+      <w:pPr>
+        <w:spacing w:after="80"/>
+      </w:pPr>
+      <w:r>
+        <w:t xml:space="preserve">a) </w:t>
+      </w:r>
+      <m:oMath>
+        <m:r>
+          <w:rPr>
+            <w:rFonts w:ascii="Cambria Math" w:eastAsiaTheme="minorEastAsia" w:hAnsi="Cambria Math"/>
+          </w:rPr>
+          <m:t>|z|&gt;0.8</m:t>
+        </m:r>
+      </m:oMath>
+      <w:r>
+        <w:t xml:space="preserve"> and</w:t>
+      </w:r>
+    </w:p>
+    <w:p>
+      <w:pPr>
+        <w:spacing w:after="200"/>
+      </w:pPr>
+      <w:r>
+        <w:t xml:space="preserve">b) </w:t>
+      </w:r>
+      <m:oMath>
+        <m:r>
+          <w:rPr>
+            <w:rFonts w:ascii="Cambria Math" w:hAnsi="Cambria Math"/>
+          </w:rPr>
+          <m:t>0.5&lt;|z|&lt;0.8</m:t>
+        </m:r>
+      </m:oMath>
+      <w:r>
         <w:t>.</w:t>
       </w:r>
     </w:p>
     <w:p>
       <w:pPr>
-        <w:pStyle w:val="ListNumber2"/>
-        <w:numPr>
-          <w:ilvl w:val="0"/>
-          <w:numId w:val="0"/>
-        </w:numPr>
-        <w:spacing w:after="240"/>
-        <w:rPr>
-          <w:rFonts w:asciiTheme="minorHAnsi" w:hAnsiTheme="minorHAnsi" w:cstheme="minorHAnsi"/>
-          <w:sz w:val="24"/>
-          <w:szCs w:val="24"/>
-        </w:rPr>
-      </w:pPr>
-      <w:r>
-        <w:rPr>
-          <w:rFonts w:asciiTheme="minorHAnsi" w:hAnsiTheme="minorHAnsi" w:cstheme="minorHAnsi"/>
-          <w:sz w:val="24"/>
-          <w:szCs w:val="24"/>
-        </w:rPr>
-        <w:t xml:space="preserve">c) </w:t>
-      </w:r>
-      <w:r>
-        <w:rPr>
-          <w:rFonts w:asciiTheme="minorHAnsi" w:hAnsiTheme="minorHAnsi" w:cstheme="minorHAnsi"/>
-          <w:sz w:val="24"/>
-          <w:szCs w:val="24"/>
-        </w:rPr>
-        <w:t xml:space="preserve"> </w:t>
-      </w:r>
-      <w:r>
-        <w:rPr>
-          <w:rFonts w:asciiTheme="minorHAnsi" w:hAnsiTheme="minorHAnsi" w:cstheme="minorHAnsi"/>
-          <w:sz w:val="24"/>
-          <w:szCs w:val="24"/>
-        </w:rPr>
-        <w:t>Explain in one sentence why this proves aliasing cannot generally be undone after sampling.</w:t>
-      </w:r>
-    </w:p>
-    <w:p>
-      <w:pPr>
-        <w:tabs>
-          <w:tab w:val="left" w:pos="1455"/>
-        </w:tabs>
-        <w:spacing w:after="240"/>
-      </w:pPr>
-      <w:r>
-        <w:t xml:space="preserve"> </w:t>
-      </w:r>
-    </w:p>
-    <w:p>
-      <w:pPr>
-        <w:spacing w:after="80"/>
-      </w:pPr>
-    </w:p>
-    <w:p>
-      <w:pPr>
-        <w:rPr>
-          <w:rFonts w:eastAsiaTheme="minorEastAsia"/>
-        </w:rPr>
-      </w:pPr>
-    </w:p>
-    <w:p/>
+        <w:spacing w:after="200"/>
+      </w:pPr>
+    </w:p>
+    <w:p>
+      <w:pPr>
+        <w:spacing w:after="200"/>
+      </w:pPr>
+    </w:p>
     <w:sectPr>
       <w:pgSz w:w="12240" w:h="15840"/>
       <w:pgMar w:top="1440" w:right="1440" w:bottom="1440" w:left="1440" w:header="720" w:footer="720" w:gutter="0"/>
@@ -3182,6 +2179,7 @@
   <w:style w:type="character" w:default="1" w:styleId="DefaultParagraphFont">
     <w:name w:val="Default Paragraph Font"/>
     <w:uiPriority w:val="1"/>
+    <w:semiHidden/>
     <w:unhideWhenUsed/>
   </w:style>
   <w:style w:type="table" w:default="1" w:styleId="TableNormal">

</xml_diff>